<commit_message>
Insere mencao ao decreto 2249
</commit_message>
<xml_diff>
--- a/modelos/Dispensa xx Proc xx -  MINUTA DE 13.07.2026.docx
+++ b/modelos/Dispensa xx Proc xx -  MINUTA DE 13.07.2026.docx
@@ -1035,7 +1035,16 @@
           <w:sz w:val="24"/>
           <w:szCs w:val="24"/>
         </w:rPr>
-        <w:t xml:space="preserve"> e pelo </w:t>
+        <w:t>,</w:t>
+      </w:r>
+      <w:r>
+        <w:rPr>
+          <w:rFonts w:ascii="Calibri" w:hAnsi="Calibri" w:cs="Calibri"/>
+          <w:bCs/>
+          <w:sz w:val="24"/>
+          <w:szCs w:val="24"/>
+        </w:rPr>
+        <w:t xml:space="preserve"> pelo </w:t>
       </w:r>
       <w:r>
         <w:rPr>
@@ -1085,7 +1094,56 @@
           <w:sz w:val="24"/>
           <w:szCs w:val="24"/>
         </w:rPr>
-        <w:t xml:space="preserve">.  </w:t>
+        <w:t xml:space="preserve"> </w:t>
+      </w:r>
+      <w:r>
+        <w:rPr>
+          <w:rFonts w:ascii="Calibri" w:hAnsi="Calibri" w:cs="Calibri"/>
+          <w:bCs/>
+          <w:sz w:val="24"/>
+          <w:szCs w:val="24"/>
+        </w:rPr>
+        <w:t xml:space="preserve">e pelo Decreto Municipal nº </w:t>
+      </w:r>
+      <w:r>
+        <w:rPr>
+          <w:rFonts w:ascii="Calibri" w:hAnsi="Calibri" w:cs="Calibri"/>
+          <w:b/>
+          <w:bCs/>
+          <w:sz w:val="24"/>
+          <w:szCs w:val="24"/>
+        </w:rPr>
+        <w:t>2249</w:t>
+      </w:r>
+      <w:r>
+        <w:rPr>
+          <w:rFonts w:ascii="Calibri" w:hAnsi="Calibri" w:cs="Calibri"/>
+          <w:bCs/>
+          <w:sz w:val="24"/>
+          <w:szCs w:val="24"/>
+        </w:rPr>
+        <w:t xml:space="preserve"> de 18 de junho de 2026 (acesso em: </w:t>
+      </w:r>
+      <w:hyperlink r:id="rId12" w:history="1">
+        <w:r>
+          <w:rPr>
+            <w:rStyle w:val="Hyperlink"/>
+            <w:rFonts w:ascii="Calibri" w:hAnsi="Calibri" w:cs="Calibri"/>
+            <w:bCs/>
+            <w:sz w:val="24"/>
+            <w:szCs w:val="24"/>
+          </w:rPr>
+          <w:t>https://ecrie.com.br/Sistema/Conteudos/DiarioOficial/upload/ASS_u_164_18062026165338.pdf</w:t>
+        </w:r>
+      </w:hyperlink>
+      <w:r>
+        <w:rPr>
+          <w:rFonts w:ascii="Calibri" w:hAnsi="Calibri" w:cs="Calibri"/>
+          <w:bCs/>
+          <w:sz w:val="24"/>
+          <w:szCs w:val="24"/>
+        </w:rPr>
+        <w:t>).</w:t>
       </w:r>
     </w:p>
     <w:p>
@@ -2167,7 +2225,7 @@
         </w:rPr>
         <w:t xml:space="preserve"> Portal Bolsa de Licitações do Brasil – BLL: </w:t>
       </w:r>
-      <w:hyperlink r:id="rId12" w:history="1">
+      <w:hyperlink r:id="rId13" w:history="1">
         <w:r>
           <w:rPr>
             <w:rStyle w:val="Hyperlink"/>
@@ -2454,7 +2512,44 @@
           <w:sz w:val="24"/>
           <w:szCs w:val="24"/>
         </w:rPr>
-        <w:t>Decreto Municipal nº 2056 de 29 de julho de 2024, da Lei Complementar n° 123 de 14 de dezembro de 2006 e demais legislações aplicáveis</w:t>
+        <w:t xml:space="preserve">Decreto Municipal nº 2056 de 29 de julho de 2024, </w:t>
+      </w:r>
+      <w:r>
+        <w:rPr>
+          <w:rFonts w:ascii="Calibri" w:hAnsi="Calibri" w:cs="Calibri"/>
+          <w:bCs/>
+          <w:sz w:val="24"/>
+          <w:szCs w:val="24"/>
+        </w:rPr>
+        <w:t xml:space="preserve">Decreto Municipal nº 2249 </w:t>
+      </w:r>
+      <w:r>
+        <w:rPr>
+          <w:rFonts w:ascii="Calibri" w:hAnsi="Calibri" w:cs="Calibri"/>
+          <w:bCs/>
+          <w:sz w:val="24"/>
+          <w:szCs w:val="24"/>
+        </w:rPr>
+        <w:lastRenderedPageBreak/>
+        <w:t>de 18 de junho de 2026,</w:t>
+      </w:r>
+      <w:r>
+        <w:rPr>
+          <w:rFonts w:ascii="Calibri" w:hAnsi="Calibri" w:cs="Calibri"/>
+          <w:bCs/>
+          <w:sz w:val="24"/>
+          <w:szCs w:val="24"/>
+        </w:rPr>
+        <w:t xml:space="preserve"> </w:t>
+      </w:r>
+      <w:r>
+        <w:rPr>
+          <w:rFonts w:ascii="Calibri" w:hAnsi="Calibri" w:cs="Calibri"/>
+          <w:bCs/>
+          <w:sz w:val="24"/>
+          <w:szCs w:val="24"/>
+        </w:rPr>
+        <w:t>da Lei Complementar n° 123 de 14 de dezembro de 2006 e demais legislações aplicáveis</w:t>
       </w:r>
       <w:r>
         <w:rPr>
@@ -3226,7 +3321,7 @@
       <w:r>
         <w:t>“BLLCOMPRAS” constante da página eletrônica da Bolsa de Licitações e Leilões do Brasil (</w:t>
       </w:r>
-      <w:hyperlink r:id="rId13" w:history="1">
+      <w:hyperlink r:id="rId14" w:history="1">
         <w:r>
           <w:rPr>
             <w:rStyle w:val="Hyperlink"/>
@@ -3258,7 +3353,7 @@
         </w:rPr>
         <w:t xml:space="preserve">QUALQUER DÚVIDA EM RELAÇÃO AO CREDENCIAMENTO, ACESSO, PARTICIPAÇÃO, FUNCIONAMENTO DO SISTEMA OPERACIONAL, FICARÁ DE RESPONSABILIDADE DE ESCLARECIMENTO PELO NÚMERO (41) 3097-4600 OU (41) 3097-4646, E-MAIL: </w:t>
       </w:r>
-      <w:hyperlink r:id="rId14" w:history="1">
+      <w:hyperlink r:id="rId15" w:history="1">
         <w:r>
           <w:rPr>
             <w:rStyle w:val="Hyperlink"/>
@@ -3354,7 +3449,11 @@
         <w:t xml:space="preserve"> </w:t>
       </w:r>
       <w:r>
-        <w:t xml:space="preserve">os interessados do ramo de atividade pertinente ao objeto da contratação, que preencham as condições e exigências, inclusive quanto à documentação, constantes deste </w:t>
+        <w:t xml:space="preserve">os interessados do ramo de atividade pertinente ao objeto da contratação, que preencham as condições e exigências, inclusive quanto à </w:t>
+      </w:r>
+      <w:r>
+        <w:lastRenderedPageBreak/>
+        <w:t xml:space="preserve">documentação, constantes deste </w:t>
       </w:r>
       <w:r>
         <w:t>Aviso</w:t>
@@ -3395,11 +3494,7 @@
         <w:t>Aviso</w:t>
       </w:r>
       <w:r>
-        <w:t xml:space="preserve"> para apresentação da </w:t>
-      </w:r>
-      <w:r>
-        <w:lastRenderedPageBreak/>
-        <w:t>proposta.</w:t>
+        <w:t xml:space="preserve"> para apresentação da proposta.</w:t>
       </w:r>
     </w:p>
     <w:p>
@@ -3533,7 +3628,7 @@
       <w:r>
         <w:t xml:space="preserve"> no Sistema de Licitações e Leilões no endereço </w:t>
       </w:r>
-      <w:hyperlink r:id="rId15" w:history="1">
+      <w:hyperlink r:id="rId16" w:history="1">
         <w:r>
           <w:rPr>
             <w:rStyle w:val="Hyperlink"/>
@@ -3727,14 +3822,14 @@
         <w:t xml:space="preserve"> junto a plataforma e à Prefeitura Municipal de São Francisco - SP</w:t>
       </w:r>
       <w:r>
-        <w:t>, devendo proceder, imediatamente, à correção ou à alteração dos registros tão logo identifique incorreção ou aqueles se tornem desatualizados.</w:t>
-      </w:r>
-      <w:r>
-        <w:t xml:space="preserve"> Para todos os casos, os dados cadastrais informados na plataforma poderão ser utilizados para fins de convocação, envio de informativos e demais atos necessários, não podendo o licitante alegar desconhecimento das comunicações realizadas, </w:t>
+        <w:t xml:space="preserve">, devendo proceder, imediatamente, à correção ou à alteração dos registros tão logo identifique incorreção </w:t>
       </w:r>
       <w:r>
         <w:lastRenderedPageBreak/>
-        <w:t>especialmente quando enviadas por e-mail.</w:t>
+        <w:t>ou aqueles se tornem desatualizados.</w:t>
+      </w:r>
+      <w:r>
+        <w:t xml:space="preserve"> Para todos os casos, os dados cadastrais informados na plataforma poderão ser utilizados para fins de convocação, envio de informativos e demais atos necessários, não podendo o licitante alegar desconhecimento das comunicações realizadas, especialmente quando enviadas por e-mail.</w:t>
       </w:r>
     </w:p>
     <w:p>
@@ -3918,7 +4013,7 @@
       <w:r>
         <w:t xml:space="preserve"> deve ser acompanhado pelos participantes por meio do portal </w:t>
       </w:r>
-      <w:hyperlink r:id="rId16" w:history="1">
+      <w:hyperlink r:id="rId17" w:history="1">
         <w:r>
           <w:rPr>
             <w:rStyle w:val="Hyperlink"/>
@@ -3942,7 +4037,7 @@
       <w:r>
         <w:t xml:space="preserve">, disponível em </w:t>
       </w:r>
-      <w:hyperlink r:id="rId17" w:history="1">
+      <w:hyperlink r:id="rId18" w:history="1">
         <w:r>
           <w:rPr>
             <w:rStyle w:val="Hyperlink"/>
@@ -4490,7 +4585,6 @@
           <w:sz w:val="24"/>
           <w:szCs w:val="24"/>
         </w:rPr>
-        <w:lastRenderedPageBreak/>
         <w:t>que se enquadrem nas seguintes vedações:</w:t>
       </w:r>
     </w:p>
@@ -4904,7 +4998,11 @@
         <w:ind w:left="0" w:firstLine="0"/>
       </w:pPr>
       <w:r>
-        <w:t xml:space="preserve">Em atendimento ao disposto na LGPD, a Administração Pública, para a realização da presente licitação, terá acesso aos dados pessoais dos representantes dos licitantes, tais como (rol exemplificativo): número do CPF e do RG, endereço </w:t>
+        <w:t xml:space="preserve">Em atendimento ao disposto na LGPD, a Administração Pública, para a realização da </w:t>
+      </w:r>
+      <w:r>
+        <w:lastRenderedPageBreak/>
+        <w:t xml:space="preserve">presente licitação, terá acesso aos dados pessoais dos representantes dos licitantes, tais como (rol exemplificativo): número do CPF e do RG, endereço </w:t>
       </w:r>
       <w:r>
         <w:t>eletrônic</w:t>
@@ -4940,7 +5038,6 @@
           <w:sz w:val="24"/>
           <w:szCs w:val="24"/>
         </w:rPr>
-        <w:lastRenderedPageBreak/>
         <w:t>Os licitantes, ao participarem, concordam em fornecer tais dados, desde que utilizados exclusivamente para persecução do interesse público, com o objetivo de executar as competências legais ou cumprir as atribuições legais do serviço público.</w:t>
       </w:r>
     </w:p>
@@ -5326,6 +5423,7 @@
         <w:rPr>
           <w:rFonts w:eastAsiaTheme="minorEastAsia"/>
         </w:rPr>
+        <w:lastRenderedPageBreak/>
         <w:t xml:space="preserve">Eventuais responsabilidades das partes serão apuradas conforme estabelecido </w:t>
       </w:r>
       <w:r>
@@ -6235,7 +6333,11 @@
         <w:t>pedidos de esclarecimentos e impugnações</w:t>
       </w:r>
       <w:r>
-        <w:t xml:space="preserve"> interpostos fora do prazo não serão conhecidos</w:t>
+        <w:t xml:space="preserve"> interpostos fora do prazo não serão </w:t>
+      </w:r>
+      <w:r>
+        <w:lastRenderedPageBreak/>
+        <w:t>conhecidos</w:t>
       </w:r>
       <w:r>
         <w:t>.</w:t>
@@ -6267,11 +6369,7 @@
         <w:ind w:left="0" w:firstLine="0"/>
       </w:pPr>
       <w:r>
-        <w:t xml:space="preserve">O recurso não conhecido não impede a Administração de rever de ofício qualquer ato </w:t>
-      </w:r>
-      <w:r>
-        <w:lastRenderedPageBreak/>
-        <w:t>ilegal, desde que não ocorrida a preclusão administrativa</w:t>
+        <w:t>O recurso não conhecido não impede a Administração de rever de ofício qualquer ato ilegal, desde que não ocorrida a preclusão administrativa</w:t>
       </w:r>
       <w:r>
         <w:t>.</w:t>
@@ -6560,7 +6658,7 @@
       <w:r>
         <w:t xml:space="preserve"> (</w:t>
       </w:r>
-      <w:hyperlink r:id="rId18" w:history="1">
+      <w:hyperlink r:id="rId19" w:history="1">
         <w:r>
           <w:rPr>
             <w:rStyle w:val="Hyperlink"/>
@@ -6979,7 +7077,11 @@
         <w:t xml:space="preserve"> diretos e indiretos </w:t>
       </w:r>
       <w:r>
-        <w:t>para perfeita entrega dos serviços e/ou itens</w:t>
+        <w:t xml:space="preserve">para perfeita entrega dos serviços </w:t>
+      </w:r>
+      <w:r>
+        <w:lastRenderedPageBreak/>
+        <w:t>e/ou itens</w:t>
       </w:r>
       <w:r>
         <w:t xml:space="preserve">, tais como: mão-de-obra, materiais, taxas, fretes, descontos, transporte (locomoção), alimentação, custos com terceiros, custos trabalhistas, seguro contra todos os </w:t>
@@ -6994,11 +7096,7 @@
         <w:t xml:space="preserve"> </w:t>
       </w:r>
       <w:r>
-        <w:t xml:space="preserve">encargos da legislação social </w:t>
-      </w:r>
-      <w:r>
-        <w:lastRenderedPageBreak/>
-        <w:t>trabalhista</w:t>
+        <w:t>encargos da legislação social trabalhista</w:t>
       </w:r>
       <w:r>
         <w:t xml:space="preserve"> e</w:t>
@@ -7560,7 +7658,16 @@
           <w:sz w:val="24"/>
           <w:szCs w:val="24"/>
         </w:rPr>
-        <w:t>Tratando-se de empresa ou sociedade estrangeira em funcionamento no país, quando a atividade assim o exigir, o Decreto de autorização e ato de registro ou autorização para funcionamento expedido pelo órgão competente.</w:t>
+        <w:t xml:space="preserve">Tratando-se de empresa ou sociedade estrangeira em funcionamento no país, quando </w:t>
+      </w:r>
+      <w:r>
+        <w:rPr>
+          <w:rFonts w:ascii="Calibri" w:hAnsi="Calibri" w:cs="Calibri"/>
+          <w:sz w:val="24"/>
+          <w:szCs w:val="24"/>
+        </w:rPr>
+        <w:lastRenderedPageBreak/>
+        <w:t>a atividade assim o exigir, o Decreto de autorização e ato de registro ou autorização para funcionamento expedido pelo órgão competente.</w:t>
       </w:r>
     </w:p>
     <w:p>
@@ -7591,16 +7698,7 @@
           <w:sz w:val="24"/>
           <w:szCs w:val="24"/>
         </w:rPr>
-        <w:t xml:space="preserve">No caso de empresário individual: inscrição no Registro Público de Empresas </w:t>
-      </w:r>
-      <w:r>
-        <w:rPr>
-          <w:rFonts w:ascii="Calibri" w:hAnsi="Calibri" w:cs="Calibri"/>
-          <w:sz w:val="24"/>
-          <w:szCs w:val="24"/>
-        </w:rPr>
-        <w:lastRenderedPageBreak/>
-        <w:t xml:space="preserve">Mercantis, a cargo da Junta Comercial da respectiva sede; </w:t>
+        <w:t xml:space="preserve">No caso de empresário individual: inscrição no Registro Público de Empresas Mercantis, a cargo da Junta Comercial da respectiva sede; </w:t>
       </w:r>
     </w:p>
     <w:p>
@@ -8574,16 +8672,7 @@
           <w:sz w:val="24"/>
           <w:szCs w:val="24"/>
         </w:rPr>
-        <w:t xml:space="preserve"> Declarações, em conjunto ou separadas, sob as penas da </w:t>
-      </w:r>
-      <w:r>
-        <w:rPr>
-          <w:rFonts w:ascii="Calibri" w:hAnsi="Calibri" w:cs="Calibri"/>
-          <w:sz w:val="24"/>
-          <w:szCs w:val="24"/>
-        </w:rPr>
-        <w:lastRenderedPageBreak/>
-        <w:t>lei, em especial o art. 299 do Código Penal Brasileiro, de que o licitante:</w:t>
+        <w:t xml:space="preserve"> Declarações, em conjunto ou separadas, sob as penas da lei, em especial o art. 299 do Código Penal Brasileiro, de que o licitante:</w:t>
       </w:r>
     </w:p>
     <w:p>
@@ -9388,6 +9477,7 @@
           <w:sz w:val="24"/>
           <w:szCs w:val="24"/>
         </w:rPr>
+        <w:lastRenderedPageBreak/>
         <w:t>Marca e/ou modelo do item a ser entregue;</w:t>
       </w:r>
     </w:p>
@@ -9484,7 +9574,6 @@
           <w:sz w:val="24"/>
           <w:szCs w:val="24"/>
         </w:rPr>
-        <w:lastRenderedPageBreak/>
         <w:t xml:space="preserve">Declaração de que nos preços propostos, inclusive nos lances que venhamos a ofertar, estão inclusos, além do lucro, todas as despesas e custos diretos e indiretos para perfeita entrega dos serviços e/ou itens, tais como: mão-de-obra, materiais, taxas, fretes, descontos, transporte (locomoção), alimentação, custos com terceiros, custos trabalhistas, seguro contra todos os riscos existentes se for o caso, garantia e tributos de qualquer natureza, como encargos da legislação social trabalhista e previdenciária, responsabilidade civil por quaisquer danos causados a  terceiros ou dispêndios resultantes de impostos, taxas e regulamentos municipais, estaduais e federais, bem como todos os custos necessários para atendimento às exigências e determinações do </w:t>
       </w:r>
       <w:r>
@@ -9898,11 +9987,8 @@
         <w:ind w:left="0" w:firstLine="0"/>
       </w:pPr>
       <w:r>
-        <w:t xml:space="preserve">A apresentação das propostas implica obrigatoriedade do cumprimento das disposições nelas contidas, em conformidade com o que dispõe o Termo de Referência, assumindo o proponente o compromisso de executar o objeto licitado nos seus termos, bem como de fornecer </w:t>
-      </w:r>
-      <w:r>
         <w:lastRenderedPageBreak/>
-        <w:t>os materiais, equipamentos, ferramentas e utensílios necessários, em quantidades e qualidades adequadas à perfeita execução contratual, promovendo, quando requerido, sua substituição.</w:t>
+        <w:t>A apresentação das propostas implica obrigatoriedade do cumprimento das disposições nelas contidas, em conformidade com o que dispõe o Termo de Referência, assumindo o proponente o compromisso de executar o objeto licitado nos seus termos, bem como de fornecer os materiais, equipamentos, ferramentas e utensílios necessários, em quantidades e qualidades adequadas à perfeita execução contratual, promovendo, quando requerido, sua substituição.</w:t>
       </w:r>
     </w:p>
     <w:p>
@@ -10448,6 +10534,7 @@
           <w:sz w:val="24"/>
           <w:szCs w:val="24"/>
         </w:rPr>
+        <w:lastRenderedPageBreak/>
         <w:t>Agente de Contratação</w:t>
       </w:r>
       <w:r>
@@ -10540,7 +10627,6 @@
         <w:ind w:left="0" w:firstLine="0"/>
       </w:pPr>
       <w:r>
-        <w:lastRenderedPageBreak/>
         <w:t>Caso o licitante não apresente lances, concorrerá com o valor de sua proposta.</w:t>
       </w:r>
     </w:p>
@@ -11152,7 +11238,20 @@
           <w:szCs w:val="24"/>
           <w:u w:val="single"/>
         </w:rPr>
-        <w:t xml:space="preserve"> e, sendo convocado o próximo colocado, este não seja ME/EPP, havendo outras ME/EPP com propostas ou lances dentro do intervalo percentual, o direito de desempate será novamente oportunizado às ME/EPPs remanescentes que ainda não o tenham exercido.</w:t>
+        <w:t xml:space="preserve"> e, sendo convocado o próximo colocado, este não seja ME/EPP, havendo outras ME/EPP com propostas </w:t>
+      </w:r>
+      <w:r>
+        <w:rPr>
+          <w:rFonts w:ascii="Calibri" w:hAnsi="Calibri" w:cs="Calibri"/>
+          <w:b/>
+          <w:i/>
+          <w:iCs/>
+          <w:sz w:val="24"/>
+          <w:szCs w:val="24"/>
+          <w:u w:val="single"/>
+        </w:rPr>
+        <w:lastRenderedPageBreak/>
+        <w:t>ou lances dentro do intervalo percentual, o direito de desempate será novamente oportunizado às ME/EPPs remanescentes que ainda não o tenham exercido.</w:t>
       </w:r>
     </w:p>
     <w:p>
@@ -11178,7 +11277,6 @@
           <w:sz w:val="24"/>
           <w:szCs w:val="24"/>
         </w:rPr>
-        <w:lastRenderedPageBreak/>
         <w:t>Esgotadas as possibilidades de exercício do direito de preferência pelas ME/EPP, prosseguira-se em favor da proposta originalmente vencedora.</w:t>
       </w:r>
     </w:p>
@@ -11776,7 +11874,11 @@
         <w:t>Aviso</w:t>
       </w:r>
       <w:r>
-        <w:t xml:space="preserve">, sem conter alternativas de preços ou de qualquer outra condição que induza o julgamento a mais de um resultado, </w:t>
+        <w:t xml:space="preserve">, sem conter alternativas de preços ou de qualquer outra condição que induza o julgamento a mais </w:t>
+      </w:r>
+      <w:r>
+        <w:lastRenderedPageBreak/>
+        <w:t xml:space="preserve">de um resultado, </w:t>
       </w:r>
       <w:r>
         <w:t>estando sujeito à</w:t>
@@ -11795,11 +11897,7 @@
         <w:ind w:left="0" w:firstLine="0"/>
       </w:pPr>
       <w:r>
-        <w:t xml:space="preserve">Considera-se inexequível a proposta que apresente preços global ou unitários simbólicos, </w:t>
-      </w:r>
-      <w:r>
-        <w:lastRenderedPageBreak/>
-        <w:t>irrisórios ou de valor zero, incompatíveis com os preços de mercado, acrescidos dos respectivos encargos, ainda que o ato convocatório da licitação não tenha estabelecido limites mínimos, exceto quando se referirem a materiais</w:t>
+        <w:t>Considera-se inexequível a proposta que apresente preços global ou unitários simbólicos, irrisórios ou de valor zero, incompatíveis com os preços de mercado, acrescidos dos respectivos encargos, ainda que o ato convocatório da licitação não tenha estabelecido limites mínimos, exceto quando se referirem a materiais</w:t>
       </w:r>
       <w:r>
         <w:t>, serviços</w:t>
@@ -12367,7 +12465,11 @@
         <w:t xml:space="preserve"> nos termos do §1 do art. 59 da Lei Federal nº 14.133/2021,</w:t>
       </w:r>
       <w:r>
-        <w:t xml:space="preserve"> não implicando, por si só, que a permanência dos demais licitantes na ordem de classificação represente classificação ou habilitação efetiva.</w:t>
+        <w:t xml:space="preserve"> não implicando, por si só, que a permanência dos demais licitantes na ordem de classificação </w:t>
+      </w:r>
+      <w:r>
+        <w:lastRenderedPageBreak/>
+        <w:t>represente classificação ou habilitação efetiva.</w:t>
       </w:r>
     </w:p>
     <w:p>
@@ -12398,11 +12500,7 @@
         <w:t xml:space="preserve">o </w:t>
       </w:r>
       <w:r>
-        <w:t xml:space="preserve">Agente de </w:t>
-      </w:r>
-      <w:r>
-        <w:lastRenderedPageBreak/>
-        <w:t>Contratação</w:t>
+        <w:t>Agente de Contratação</w:t>
       </w:r>
       <w:r>
         <w:t xml:space="preserve"> verificar</w:t>
@@ -13111,6 +13209,7 @@
           <w:sz w:val="24"/>
           <w:szCs w:val="24"/>
         </w:rPr>
+        <w:lastRenderedPageBreak/>
         <w:t>atualização de documentos cuja validade tenha expirado após a data de recebimento das propostas.</w:t>
       </w:r>
     </w:p>
@@ -13124,7 +13223,6 @@
         <w:ind w:left="0" w:firstLine="0"/>
       </w:pPr>
       <w:r>
-        <w:lastRenderedPageBreak/>
         <w:t>N</w:t>
       </w:r>
       <w:r>
@@ -13613,7 +13711,14 @@
         <w:rPr>
           <w:u w:val="single"/>
         </w:rPr>
-        <w:t>mesmo que esta apresente alguma restrição</w:t>
+        <w:t xml:space="preserve">mesmo que esta apresente alguma </w:t>
+      </w:r>
+      <w:r>
+        <w:rPr>
+          <w:u w:val="single"/>
+        </w:rPr>
+        <w:lastRenderedPageBreak/>
+        <w:t>restrição</w:t>
       </w:r>
       <w:r>
         <w:t>, conforme o art. 43 da LC</w:t>
@@ -13671,16 +13776,7 @@
           <w:sz w:val="24"/>
           <w:szCs w:val="24"/>
         </w:rPr>
-        <w:t xml:space="preserve">, </w:t>
-      </w:r>
-      <w:r>
-        <w:rPr>
-          <w:rFonts w:ascii="Calibri" w:hAnsi="Calibri" w:cs="Calibri"/>
-          <w:sz w:val="24"/>
-          <w:szCs w:val="24"/>
-        </w:rPr>
-        <w:lastRenderedPageBreak/>
-        <w:t xml:space="preserve">será assegurado o prazo de </w:t>
+        <w:t xml:space="preserve">, será assegurado o prazo de </w:t>
       </w:r>
       <w:r>
         <w:rPr>
@@ -14097,7 +14193,11 @@
         <w:ind w:left="0" w:firstLine="0"/>
       </w:pPr>
       <w:r>
-        <w:t>O licitante deverá indicar todos os itens ou lotes para os quais desejar recorrer e os memoriais com razões recursais presencialmente ou via e-mail dispensa@saofrancisco.sp.gov.br.</w:t>
+        <w:t xml:space="preserve">O licitante deverá indicar todos os itens ou lotes para os quais desejar recorrer e os memoriais com razões recursais presencialmente ou via e-mail </w:t>
+      </w:r>
+      <w:r>
+        <w:lastRenderedPageBreak/>
+        <w:t>dispensa@saofrancisco.sp.gov.br.</w:t>
       </w:r>
     </w:p>
     <w:p>
@@ -14110,11 +14210,7 @@
         <w:ind w:left="0" w:firstLine="0"/>
       </w:pPr>
       <w:r>
-        <w:t xml:space="preserve">Apresentados os recursos na forma estabelecida, será automaticamente concedido prazo </w:t>
-      </w:r>
-      <w:r>
-        <w:lastRenderedPageBreak/>
-        <w:t>de 03 (três) dias úteis para que os demais licitantes apresentem suas contrarrazões, sendo que os licitantes envolvidos serão comunicados por e-mail.</w:t>
+        <w:t>Apresentados os recursos na forma estabelecida, será automaticamente concedido prazo de 03 (três) dias úteis para que os demais licitantes apresentem suas contrarrazões, sendo que os licitantes envolvidos serão comunicados por e-mail.</w:t>
       </w:r>
     </w:p>
     <w:p>
@@ -14610,7 +14706,14 @@
         <w:rPr>
           <w:rFonts w:eastAsia="Arial Unicode MS"/>
         </w:rPr>
-        <w:t>, nas contratações, a ordem de classificação dos licitantes.</w:t>
+        <w:t xml:space="preserve">, nas contratações, a ordem de classificação dos </w:t>
+      </w:r>
+      <w:r>
+        <w:rPr>
+          <w:rFonts w:eastAsia="Arial Unicode MS"/>
+        </w:rPr>
+        <w:lastRenderedPageBreak/>
+        <w:t>licitantes.</w:t>
       </w:r>
     </w:p>
     <w:p>
@@ -14641,14 +14744,7 @@
         <w:rPr>
           <w:rFonts w:eastAsia="Arial Unicode MS"/>
         </w:rPr>
-        <w:t xml:space="preserve"> não prejudicará o resultado do </w:t>
-      </w:r>
-      <w:r>
-        <w:rPr>
-          <w:rFonts w:eastAsia="Arial Unicode MS"/>
-        </w:rPr>
-        <w:lastRenderedPageBreak/>
-        <w:t xml:space="preserve">certame em relação </w:t>
+        <w:t xml:space="preserve"> não prejudicará o resultado do certame em relação </w:t>
       </w:r>
       <w:r>
         <w:rPr>
@@ -15127,6 +15223,7 @@
         <w:ind w:left="0" w:firstLine="0"/>
       </w:pPr>
       <w:r>
+        <w:lastRenderedPageBreak/>
         <w:t>O acolhimento do recurso invalida tão somente os atos insuscetíveis de aproveitamento</w:t>
       </w:r>
       <w:r>
@@ -15149,11 +15246,7 @@
         <w:t xml:space="preserve"> ou indeferido</w:t>
       </w:r>
       <w:r>
-        <w:t xml:space="preserve"> não impede a Administração de rever de ofício </w:t>
-      </w:r>
-      <w:r>
-        <w:lastRenderedPageBreak/>
-        <w:t>qualquer ato ilegal, desde que não ocorrida a preclusão administrativa</w:t>
+        <w:t xml:space="preserve"> não impede a Administração de rever de ofício qualquer ato ilegal, desde que não ocorrida a preclusão administrativa</w:t>
       </w:r>
       <w:r>
         <w:t>, nos termos da Súmula nº 473 do Supremo Tribunal Federal (STF).</w:t>
@@ -15788,7 +15881,14 @@
         <w:rPr>
           <w:rFonts w:eastAsia="Arial Unicode MS"/>
         </w:rPr>
-        <w:t xml:space="preserve"> para o registro de todos os itens constantes no Termo de Referência, com a indicação do licitante vencedor, a descrição do(s) item(ns), as respectivas quantidades, preços registrados e demais condições.</w:t>
+        <w:t xml:space="preserve"> para o registro de todos os itens constantes no Termo de Referência, com a indicação do licitante </w:t>
+      </w:r>
+      <w:r>
+        <w:rPr>
+          <w:rFonts w:eastAsia="Arial Unicode MS"/>
+        </w:rPr>
+        <w:lastRenderedPageBreak/>
+        <w:t>vencedor, a descrição do(s) item(ns), as respectivas quantidades, preços registrados e demais condições.</w:t>
       </w:r>
     </w:p>
     <w:p>
@@ -15807,7 +15907,6 @@
         <w:rPr>
           <w:rFonts w:eastAsia="Arial Unicode MS"/>
         </w:rPr>
-        <w:lastRenderedPageBreak/>
         <w:t>Durante a vigência do contrato</w:t>
       </w:r>
       <w:r>
@@ -29228,7 +29327,19 @@
         <w:t xml:space="preserve">Federal nº </w:t>
       </w:r>
       <w:r>
-        <w:t>14.133/2021, Decreto Municipal 2056/2024 e demais legislações aplicáveis.</w:t>
+        <w:t>14.133/2021, Decreto Municipal 2056/2024</w:t>
+      </w:r>
+      <w:r>
+        <w:t xml:space="preserve">, </w:t>
+      </w:r>
+      <w:r>
+        <w:rPr>
+          <w:bCs/>
+        </w:rPr>
+        <w:t xml:space="preserve">Decreto Municipal 2249/2026 </w:t>
+      </w:r>
+      <w:r>
+        <w:t>e demais legislações aplicáveis.</w:t>
       </w:r>
     </w:p>
     <w:p>
@@ -29492,7 +29603,16 @@
                 <w:sz w:val="24"/>
                 <w:szCs w:val="24"/>
               </w:rPr>
-              <w:t>VALOR UNIT.</w:t>
+              <w:t xml:space="preserve">VALOR </w:t>
+            </w:r>
+            <w:r>
+              <w:rPr>
+                <w:rFonts w:ascii="Calibri" w:eastAsia="Arial Unicode MS" w:hAnsi="Calibri" w:cs="Calibri"/>
+                <w:sz w:val="24"/>
+                <w:szCs w:val="24"/>
+              </w:rPr>
+              <w:lastRenderedPageBreak/>
+              <w:t>UNIT.</w:t>
             </w:r>
           </w:p>
         </w:tc>
@@ -29523,7 +29643,17 @@
                 <w:sz w:val="24"/>
                 <w:szCs w:val="24"/>
               </w:rPr>
-              <w:t>VALOR TOTAL</w:t>
+              <w:lastRenderedPageBreak/>
+              <w:t xml:space="preserve">VALOR </w:t>
+            </w:r>
+            <w:r>
+              <w:rPr>
+                <w:rFonts w:ascii="Calibri" w:eastAsia="Arial Unicode MS" w:hAnsi="Calibri" w:cs="Calibri"/>
+                <w:sz w:val="24"/>
+                <w:szCs w:val="24"/>
+              </w:rPr>
+              <w:lastRenderedPageBreak/>
+              <w:t>TOTAL</w:t>
             </w:r>
           </w:p>
         </w:tc>
@@ -30198,6 +30328,7 @@
           <w:sz w:val="24"/>
           <w:szCs w:val="24"/>
         </w:rPr>
+        <w:lastRenderedPageBreak/>
         <w:t>Efetuar os pagamentos devidos à Contratada, observadas as condições, prazos e formas estabelecidas neste Contrato, bem como a regularidade fiscal e trabalhista da contratada.</w:t>
       </w:r>
     </w:p>
@@ -30227,7 +30358,6 @@
           <w:sz w:val="24"/>
           <w:szCs w:val="24"/>
         </w:rPr>
-        <w:lastRenderedPageBreak/>
         <w:t>Aplicar, quando cabível, as penalidades previstas neste Contrato e na legislação, em caso de inexecução total ou parcial, irregularidades ou atrasos injustificados.</w:t>
       </w:r>
     </w:p>
@@ -30773,6 +30903,7 @@
           <w:szCs w:val="24"/>
           <w:lang w:eastAsia="en-US" w:bidi="en-US"/>
         </w:rPr>
+        <w:lastRenderedPageBreak/>
         <w:t>Adotar todas as providências necessárias à preservação do meio ambiente, responsabilizando-se por danos causados por si ou por seus empregados, prepostos, subcontratados ou fornecedores.</w:t>
       </w:r>
     </w:p>
@@ -30807,7 +30938,6 @@
           <w:szCs w:val="24"/>
           <w:lang w:eastAsia="en-US" w:bidi="en-US"/>
         </w:rPr>
-        <w:lastRenderedPageBreak/>
         <w:t>Arcar com todos os custos diretos e indiretos relativos à execução do contrato, inclusive encargos trabalhistas, previdenciários, fiscais, comerciais, securitários, de transporte, alimentação, equipamentos, energia elétrica e comunicações.</w:t>
       </w:r>
     </w:p>
@@ -31318,6 +31448,7 @@
           <w:sz w:val="24"/>
           <w:szCs w:val="24"/>
         </w:rPr>
+        <w:lastRenderedPageBreak/>
         <w:t>Cumprir com todas as demais normais que, embora não citadas diretamente, sejam aplicáveis naturalmente à execução.</w:t>
       </w:r>
     </w:p>
@@ -31348,17 +31479,7 @@
           <w:sz w:val="24"/>
           <w:szCs w:val="24"/>
         </w:rPr>
-        <w:t xml:space="preserve">Promover o afastamento, no prazo máximo de 24 (vinte e quatro) horas após o recebimento da notificação, de qualquer dos seus empregados, fornecedores ou prestadores de </w:t>
-      </w:r>
-      <w:r>
-        <w:rPr>
-          <w:rFonts w:ascii="Calibri" w:eastAsiaTheme="minorEastAsia" w:hAnsi="Calibri" w:cs="Calibri"/>
-          <w:color w:val="000000"/>
-          <w:sz w:val="24"/>
-          <w:szCs w:val="24"/>
-        </w:rPr>
-        <w:lastRenderedPageBreak/>
-        <w:t>serviço que não corresponder à confiança ou perturbar a ação de qualquer Departamento da Administração Pública.</w:t>
+        <w:t>Promover o afastamento, no prazo máximo de 24 (vinte e quatro) horas após o recebimento da notificação, de qualquer dos seus empregados, fornecedores ou prestadores de serviço que não corresponder à confiança ou perturbar a ação de qualquer Departamento da Administração Pública.</w:t>
       </w:r>
     </w:p>
     <w:p>
@@ -31734,7 +31855,11 @@
         <w:ind w:left="0" w:firstLine="0"/>
       </w:pPr>
       <w:r>
-        <w:t xml:space="preserve">Os produtos/serviços rejeitados deverão ser substituídos pela Contratada no prazo máximo de </w:t>
+        <w:t xml:space="preserve">Os produtos/serviços rejeitados deverão ser substituídos pela Contratada no prazo </w:t>
+      </w:r>
+      <w:r>
+        <w:lastRenderedPageBreak/>
+        <w:t xml:space="preserve">máximo de </w:t>
       </w:r>
       <w:r>
         <w:t>{{PRAZO DEVOLUCAO}}</w:t>
@@ -31756,11 +31881,7 @@
         <w:ind w:left="0" w:firstLine="0"/>
       </w:pPr>
       <w:r>
-        <w:t xml:space="preserve">Especialmente, mas não limitado, nos casos de prestação de serviços, contínuos ou não, alternativamente ao encaminhamento para comissão sancionadora, a forma de refazimento </w:t>
-      </w:r>
-      <w:r>
-        <w:lastRenderedPageBreak/>
-        <w:t>poderá ser definida pelo fiscal do Contrato, tendo como amparo o CAPÍTULO XII – DOS MEIOS ALTERNATIVOS DE RESOLUÇÃO DE CONTROVÉRSIAS da Lei Federal nº 14.133/2021 e demais normas aplicáveis.</w:t>
+        <w:t>Especialmente, mas não limitado, nos casos de prestação de serviços, contínuos ou não, alternativamente ao encaminhamento para comissão sancionadora, a forma de refazimento poderá ser definida pelo fiscal do Contrato, tendo como amparo o CAPÍTULO XII – DOS MEIOS ALTERNATIVOS DE RESOLUÇÃO DE CONTROVÉRSIAS da Lei Federal nº 14.133/2021 e demais normas aplicáveis.</w:t>
       </w:r>
     </w:p>
     <w:p>
@@ -32390,7 +32511,17 @@
           <w:sz w:val="24"/>
           <w:szCs w:val="24"/>
         </w:rPr>
-        <w:t>quando necessária a modificação da forma de pagamento por imposição de circunstâncias supervenientes, mantido o valor inicial atualizado e vedada a antecipação do pagamento em relação ao cronograma financeiro fixado sem a correspondente contraprestação de fornecimento de bens ou execução de obra ou serviço;</w:t>
+        <w:t xml:space="preserve">quando necessária a modificação da forma de pagamento por imposição de circunstâncias supervenientes, mantido o valor inicial atualizado e vedada a antecipação do </w:t>
+      </w:r>
+      <w:r>
+        <w:rPr>
+          <w:rFonts w:ascii="Calibri" w:eastAsia="Arial Unicode MS" w:hAnsi="Calibri" w:cs="Calibri"/>
+          <w:bCs/>
+          <w:sz w:val="24"/>
+          <w:szCs w:val="24"/>
+        </w:rPr>
+        <w:lastRenderedPageBreak/>
+        <w:t>pagamento em relação ao cronograma financeiro fixado sem a correspondente contraprestação de fornecimento de bens ou execução de obra ou serviço;</w:t>
       </w:r>
     </w:p>
     <w:p>
@@ -32424,17 +32555,7 @@
           <w:sz w:val="24"/>
           <w:szCs w:val="24"/>
         </w:rPr>
-        <w:t xml:space="preserve">para restabelecer o equilíbrio econômico-financeiro inicial do contrato em caso de força maior, caso fortuito ou fato do príncipe ou em decorrência de fatos imprevisíveis ou </w:t>
-      </w:r>
-      <w:r>
-        <w:rPr>
-          <w:rFonts w:ascii="Calibri" w:eastAsia="Arial Unicode MS" w:hAnsi="Calibri" w:cs="Calibri"/>
-          <w:bCs/>
-          <w:sz w:val="24"/>
-          <w:szCs w:val="24"/>
-        </w:rPr>
-        <w:lastRenderedPageBreak/>
-        <w:t>previsíveis de consequências incalculáveis, que inviabilizem a execução do contrato tal como pactuado, respeitada, em qualquer caso, a repartição objetiva de risco estabelecida no contrato.</w:t>
+        <w:t>para restabelecer o equilíbrio econômico-financeiro inicial do contrato em caso de força maior, caso fortuito ou fato do príncipe ou em decorrência de fatos imprevisíveis ou previsíveis de consequências incalculáveis, que inviabilizem a execução do contrato tal como pactuado, respeitada, em qualquer caso, a repartição objetiva de risco estabelecida no contrato.</w:t>
       </w:r>
     </w:p>
     <w:p>
@@ -32727,7 +32848,15 @@
           <w:rFonts w:eastAsia="Arial Unicode MS"/>
           <w:bCs/>
         </w:rPr>
-        <w:t xml:space="preserve"> e a Contratada não poder cumprir as obrigações estabelecidas no instrumento contratual, será facultado a Contratada requerer à Administração a alteração do preço registrado, mediante comprovação de fato superveniente que o impossibilite de cumprir o compromisso. </w:t>
+        <w:t xml:space="preserve"> e a Contratada não poder cumprir as obrigações estabelecidas no instrumento contratual, será facultado a Contratada requerer à Administração a alteração do </w:t>
+      </w:r>
+      <w:r>
+        <w:rPr>
+          <w:rFonts w:eastAsia="Arial Unicode MS"/>
+          <w:bCs/>
+        </w:rPr>
+        <w:lastRenderedPageBreak/>
+        <w:t xml:space="preserve">preço registrado, mediante comprovação de fato superveniente que o impossibilite de cumprir o compromisso. </w:t>
       </w:r>
     </w:p>
     <w:p>
@@ -32777,7 +32906,6 @@
           <w:rFonts w:eastAsia="Arial Unicode MS"/>
           <w:bCs/>
         </w:rPr>
-        <w:lastRenderedPageBreak/>
         <w:t>inviabilidade do preço registrado em relação às condições inicialmente pactuadas.</w:t>
       </w:r>
     </w:p>
@@ -33393,6 +33521,7 @@
         <w:ind w:left="0" w:firstLine="0"/>
       </w:pPr>
       <w:r>
+        <w:lastRenderedPageBreak/>
         <w:t>Os fiscais e gestor ora designados poderão vir a ser substituídos à critério da Administração.</w:t>
       </w:r>
     </w:p>
@@ -33415,11 +33544,7 @@
         <w:t xml:space="preserve">será exercida por representante da Contratante, ao qual competirá dirimir as dúvidas que surgirem no curso da vigência do </w:t>
       </w:r>
       <w:r>
-        <w:t xml:space="preserve">instrumento </w:t>
-      </w:r>
-      <w:r>
-        <w:lastRenderedPageBreak/>
-        <w:t>contratual</w:t>
+        <w:t>instrumento contratual</w:t>
       </w:r>
       <w:r>
         <w:t xml:space="preserve"> </w:t>
@@ -33924,7 +34049,11 @@
         <w:ind w:left="0" w:firstLine="0"/>
       </w:pPr>
       <w:r>
-        <w:t>O licitante ou o contratado responderá administrativamente pelas infrações previstas na Lei Federal nº 14.133/2021, no Decreto Municipal nº 2.249/2026, neste Edital e no instrumento contratual, especialmente aquelas relacionadas à inexecução total ou parcial, ao atraso injustificado na execução, à não manutenção da proposta, à recusa em celebrar o contrato, à apresentação de documentação ou declaração falsa, à fraude, ao comportamento inidôneo e aos demais atos previstos na legislação aplicável.</w:t>
+        <w:t xml:space="preserve">O licitante ou o contratado responderá administrativamente pelas infrações previstas na Lei Federal nº 14.133/2021, no Decreto Municipal nº 2.249/2026, neste Edital e no instrumento contratual, especialmente aquelas relacionadas à inexecução total ou parcial, ao atraso injustificado na execução, à não manutenção da proposta, à recusa em celebrar o contrato, à apresentação de documentação ou declaração falsa, à fraude, ao comportamento inidôneo e aos </w:t>
+      </w:r>
+      <w:r>
+        <w:lastRenderedPageBreak/>
+        <w:t>demais atos previstos na legislação aplicável.</w:t>
       </w:r>
     </w:p>
     <w:p>
@@ -33937,11 +34066,7 @@
         <w:ind w:left="0" w:firstLine="0"/>
       </w:pPr>
       <w:r>
-        <w:t xml:space="preserve">O processo administrativo sancionador obedecerá, dentre outros, aos princípios da transparência, legalidade, finalidade, motivação, razoabilidade, proporcionalidade, moralidade, ampla defesa, contraditório, segurança jurídica, impessoalidade, eficiência, celeridade, </w:t>
-      </w:r>
-      <w:r>
-        <w:lastRenderedPageBreak/>
-        <w:t>oficialidade, publicidade e supremacia do interesse público.</w:t>
+        <w:t>O processo administrativo sancionador obedecerá, dentre outros, aos princípios da transparência, legalidade, finalidade, motivação, razoabilidade, proporcionalidade, moralidade, ampla defesa, contraditório, segurança jurídica, impessoalidade, eficiência, celeridade, oficialidade, publicidade e supremacia do interesse público.</w:t>
       </w:r>
     </w:p>
     <w:p>
@@ -34359,6 +34484,7 @@
         <w:ind w:left="0" w:firstLine="0"/>
       </w:pPr>
       <w:r>
+        <w:lastRenderedPageBreak/>
         <w:t>Não serão aplicadas multas moratórias e compensatórias pelo mesmo fato contratual.</w:t>
       </w:r>
     </w:p>
@@ -34400,7 +34526,6 @@
           <w:highlight w:val="yellow"/>
           <w:u w:val="single"/>
         </w:rPr>
-        <w:lastRenderedPageBreak/>
         <w:t>A aplicação de multa moratória será em percentual de 1% (um por cento) por dia de atraso na entrega do objeto da contratação ou de eventual obrigação acessória, recaindo o cálculo sobre o valor da parcela inadimplida até o limite de 10% (dez por cento) do instrumento contratual ou do instrumento equivalente.</w:t>
       </w:r>
     </w:p>
@@ -34586,6 +34711,7 @@
         <w:ind w:left="0" w:firstLine="0"/>
       </w:pPr>
       <w:r>
+        <w:lastRenderedPageBreak/>
         <w:t>Constatada a ocorrência de alguma infração administrativa, o responsável pela área de contratações ou o fiscal ou gestor de instrumento contratual deverá:</w:t>
       </w:r>
     </w:p>
@@ -34607,11 +34733,7 @@
       </w:r>
       <w:proofErr w:type="gramEnd"/>
       <w:r>
-        <w:t xml:space="preserve">, no e-mail informado no instrumento contratual ou proposta, o licitante ou o contratado para, no prazo de até 5 (cinco) dias úteis, apresentar justificativa e, em </w:t>
-      </w:r>
-      <w:r>
-        <w:lastRenderedPageBreak/>
-        <w:t>sendo o caso, realizar a correção da irregularidade;</w:t>
+        <w:t>, no e-mail informado no instrumento contratual ou proposta, o licitante ou o contratado para, no prazo de até 5 (cinco) dias úteis, apresentar justificativa e, em sendo o caso, realizar a correção da irregularidade;</w:t>
       </w:r>
     </w:p>
     <w:p>
@@ -34908,7 +35030,11 @@
         <w:ind w:left="0" w:firstLine="0"/>
       </w:pPr>
       <w:r>
-        <w:t>Apresentado o relatório, os membros da Comissão Sancionadora ficarão à disposição do Presidente para prestação de qualquer esclarecimento necessário.</w:t>
+        <w:t xml:space="preserve">Apresentado o relatório, os membros da Comissão Sancionadora ficarão à disposição do </w:t>
+      </w:r>
+      <w:r>
+        <w:lastRenderedPageBreak/>
+        <w:t>Presidente para prestação de qualquer esclarecimento necessário.</w:t>
       </w:r>
     </w:p>
     <w:p>
@@ -34934,11 +35060,7 @@
         <w:ind w:left="0" w:firstLine="0"/>
       </w:pPr>
       <w:r>
-        <w:t xml:space="preserve">A autoridade competente, considerando o relatório do PAS, ao aplicar as sanções, </w:t>
-      </w:r>
-      <w:r>
-        <w:lastRenderedPageBreak/>
-        <w:t>avaliará:</w:t>
+        <w:t>A autoridade competente, considerando o relatório do PAS, ao aplicar as sanções, avaliará:</w:t>
       </w:r>
     </w:p>
     <w:p>
@@ -35430,7 +35552,11 @@
       </w:r>
       <w:proofErr w:type="gramEnd"/>
       <w:r>
-        <w:t xml:space="preserve"> atos de mero expediente ou preparatórios de decisões, bem como em face de análises técnicas e pareceres ou decisões irrecorríveis.</w:t>
+        <w:t xml:space="preserve"> atos de mero expediente ou preparatórios de decisões, bem como em </w:t>
+      </w:r>
+      <w:r>
+        <w:lastRenderedPageBreak/>
+        <w:t>face de análises técnicas e pareceres ou decisões irrecorríveis.</w:t>
       </w:r>
     </w:p>
     <w:p>
@@ -35456,11 +35582,7 @@
         <w:ind w:left="0" w:firstLine="0"/>
       </w:pPr>
       <w:r>
-        <w:t xml:space="preserve">O trânsito em julgado da decisão administrativa ocorrerá quando decorridos os prazos </w:t>
-      </w:r>
-      <w:r>
-        <w:lastRenderedPageBreak/>
-        <w:t>para interposição de recurso ou reconsideração da decisão sem sua oposição ou após o julgamento dos recursos ou pedido de reconsideração proferidos pela autoridade competente.</w:t>
+        <w:t>O trânsito em julgado da decisão administrativa ocorrerá quando decorridos os prazos para interposição de recurso ou reconsideração da decisão sem sua oposição ou após o julgamento dos recursos ou pedido de reconsideração proferidos pela autoridade competente.</w:t>
       </w:r>
     </w:p>
     <w:p>
@@ -35835,7 +35957,16 @@
           <w:sz w:val="24"/>
           <w:szCs w:val="24"/>
         </w:rPr>
-        <w:t xml:space="preserve"> ou de cláusulas contratuais, de especificações, de projetos ou de prazos;</w:t>
+        <w:t xml:space="preserve"> ou de cláusulas </w:t>
+      </w:r>
+      <w:r>
+        <w:rPr>
+          <w:rFonts w:ascii="Calibri" w:hAnsi="Calibri" w:cs="Calibri"/>
+          <w:sz w:val="24"/>
+          <w:szCs w:val="24"/>
+        </w:rPr>
+        <w:lastRenderedPageBreak/>
+        <w:t>contratuais, de especificações, de projetos ou de prazos;</w:t>
       </w:r>
     </w:p>
     <w:p>
@@ -35897,16 +36028,7 @@
           <w:sz w:val="24"/>
           <w:szCs w:val="24"/>
         </w:rPr>
-        <w:t xml:space="preserve">alteração social ou modificação da finalidade ou da estrutura da empresa que restrinja </w:t>
-      </w:r>
-      <w:r>
-        <w:rPr>
-          <w:rFonts w:ascii="Calibri" w:hAnsi="Calibri" w:cs="Calibri"/>
-          <w:sz w:val="24"/>
-          <w:szCs w:val="24"/>
-        </w:rPr>
-        <w:lastRenderedPageBreak/>
-        <w:t>sua capacidade de concluir o instrumento contratual;</w:t>
+        <w:t>alteração social ou modificação da finalidade ou da estrutura da empresa que restrinja sua capacidade de concluir o instrumento contratual;</w:t>
       </w:r>
     </w:p>
     <w:p>
@@ -36335,7 +36457,16 @@
           <w:sz w:val="24"/>
           <w:szCs w:val="24"/>
         </w:rPr>
-        <w:t>assegurarão ao contratado o direito de optar pela suspensão do cumprimento das obrigações assumidas até a normalização da situação, admitido o restabelecimento do equilíbrio econômico-financeiro do instrumento contratual, na forma da alínea “d” do inciso II do caput do art. 124 da Lei 14.133/21.</w:t>
+        <w:t xml:space="preserve">assegurarão ao contratado o direito de optar pela suspensão do cumprimento das </w:t>
+      </w:r>
+      <w:r>
+        <w:rPr>
+          <w:rFonts w:ascii="Calibri" w:hAnsi="Calibri" w:cs="Calibri"/>
+          <w:sz w:val="24"/>
+          <w:szCs w:val="24"/>
+        </w:rPr>
+        <w:lastRenderedPageBreak/>
+        <w:t>obrigações assumidas até a normalização da situação, admitido o restabelecimento do equilíbrio econômico-financeiro do instrumento contratual, na forma da alínea “d” do inciso II do caput do art. 124 da Lei 14.133/21.</w:t>
       </w:r>
     </w:p>
     <w:p>
@@ -36348,11 +36479,7 @@
         <w:ind w:left="0" w:firstLine="0"/>
       </w:pPr>
       <w:r>
-        <w:t xml:space="preserve">Os emitentes das garantias previstas no art. 96 da Lei 14.133/21, quando for o caso, serão </w:t>
-      </w:r>
-      <w:r>
-        <w:lastRenderedPageBreak/>
-        <w:t>notificados pelo contratante quanto ao início de processo administrativo para apuração de descumprimento de cláusulas contratuais.</w:t>
+        <w:t>Os emitentes das garantias previstas no art. 96 da Lei 14.133/21, quando for o caso, serão notificados pelo contratante quanto ao início de processo administrativo para apuração de descumprimento de cláusulas contratuais.</w:t>
       </w:r>
     </w:p>
     <w:p>
@@ -36962,7 +37089,6 @@
           <w:rFonts w:eastAsiaTheme="minorEastAsia"/>
           <w:color w:val="000000"/>
         </w:rPr>
-        <w:lastRenderedPageBreak/>
         <w:t>As partes se comprometem a manter sigilo e confidencialidade de todas as informações – em especial os dados pessoais e os dados pessoais sensíveis – a que tem acesso em decorrência da execução contratual, em consonância com o disposto na Lei nº 13.709/2018 (Lei Geral de Proteção de Dados Pessoais - LGPD), sendo vedado o repasse das informações a outras empresas ou pessoas, salvo aquelas decorrentes de obrigações legais ou para viabilizar o cumprimento do instrumento contratual.</w:t>
       </w:r>
     </w:p>
@@ -37501,7 +37627,6 @@
           <w:szCs w:val="24"/>
           <w:lang w:eastAsia="en-US" w:bidi="en-US"/>
         </w:rPr>
-        <w:lastRenderedPageBreak/>
         <w:t>As partes elegem o Foro desta Comarca Palmeira D’ Oeste, Estado de São Paulo, para dirimir quaisquer dúvidas oriundas do presente contrato, renunciando a qualquer outro, por mais privilegiado que seja.</w:t>
       </w:r>
     </w:p>
@@ -38771,7 +38896,7 @@
         </w:rPr>
         <w:t xml:space="preserve">: </w:t>
       </w:r>
-      <w:hyperlink r:id="rId19" w:history="1">
+      <w:hyperlink r:id="rId20" w:history="1">
         <w:r>
           <w:rPr>
             <w:rFonts w:ascii="Calibri" w:hAnsi="Calibri" w:cs="Calibri"/>
@@ -45837,7 +45962,6 @@
   <w:style w:type="character" w:default="1" w:styleId="Fontepargpadro">
     <w:name w:val="Default Paragraph Font"/>
     <w:uiPriority w:val="1"/>
-    <w:semiHidden/>
     <w:unhideWhenUsed/>
   </w:style>
   <w:style w:type="table" w:default="1" w:styleId="Tabelanormal">

</xml_diff>